<commit_message>
fix(sales): 5 lỗi BP Sale báo trong sinh HĐ SC/PI
1. cont_type thiếu apostrophe (foot mark) — "20DC" → "20'", "40HC" → "40'"
   Áp dụng tại service render layer, không phải template.

2+3. {extra_terms} placement sai:
   - SC: chuyển từ "Term of Payment" section → cuối Documents section
     (sau Fumigation cho CIF / sau Phytosanitary cho FOB). Styled khớp
     list Documents.
   - PI: xóa hoàn toàn — extra_terms chỉ xuất hiện ở SC.

4. shipment_time mất line break — đổi <Input> → <Input.TextArea autoSize>
   trong SalesOrderCreatePage. Service đã có linebreaks: true sẵn.

5. PI hardcode câu LC draft → wrap bằng {#is_lc_payment}...{/is_lc_payment}
   để khi payment=D/P không hiển thị nhầm câu LC. Chỉ áp dụng PI_CIF (PI_FOB
   không có câu này từ đầu).

Verify bằng render test với 2 case payment=L/C và payment=D/P, cả 4 file
output khớp expected output.

Co-Authored-By: Claude Opus 4.7 (1M context) <noreply@anthropic.com>
</commit_message>
<xml_diff>
--- a/public/contract-templates/template_PI_CIF.docx
+++ b/public/contract-templates/template_PI_CIF.docx
@@ -1121,11 +1121,6 @@
             </w:r>
           </w:p>
           <w:p>
-            <w:r>
-              <w:t>{#has_extra_terms}Other Conditions: {extra_terms}{/has_extra_terms}</w:t>
-            </w:r>
-          </w:p>
-          <w:p>
             <w:pPr>
               <w:spacing w:line="276" w:lineRule="auto"/>
               <w:jc w:val="both"/>
@@ -1142,7 +1137,7 @@
                 <w:sz w:val="26"/>
                 <w:szCs w:val="26"/>
               </w:rPr>
-              <w:t>The L/C draft must be opened within five (5) days from the contract signing date.</w:t>
+              <w:t>{#is_lc_payment}The L/C draft must be opened within five (5) days from the contract signing date.{/is_lc_payment}</w:t>
             </w:r>
           </w:p>
           <w:p>

</xml_diff>